<commit_message>
[Desktop] started on the technical section of the Pegasus essay
</commit_message>
<xml_diff>
--- a/CS205/Pegasus Essay.docx
+++ b/CS205/Pegasus Essay.docx
@@ -396,10 +396,7 @@
         </w:numPr>
       </w:pPr>
       <w:r>
-        <w:t>H</w:t>
-      </w:r>
-      <w:r>
-        <w:t>ow are they currently being affected by Pegasus:</w:t>
+        <w:t>How are they currently being affected by Pegasus:</w:t>
       </w:r>
     </w:p>
     <w:p>
@@ -435,10 +432,7 @@
         </w:numPr>
       </w:pPr>
       <w:r>
-        <w:t>Which organizations have been interested in Pegasus</w:t>
-      </w:r>
-      <w:r>
-        <w:t>:</w:t>
+        <w:t>Which organizations have been interested in Pegasus:</w:t>
       </w:r>
     </w:p>
     <w:p>
@@ -475,31 +469,7 @@
           <w:rPr>
             <w:rStyle w:val="Hyperlink"/>
           </w:rPr>
-          <w:t>https://securitylab.amnesty.org</w:t>
-        </w:r>
-        <w:r>
-          <w:rPr>
-            <w:rStyle w:val="Hyperlink"/>
-          </w:rPr>
-          <w:t>/</w:t>
-        </w:r>
-        <w:r>
-          <w:rPr>
-            <w:rStyle w:val="Hyperlink"/>
-          </w:rPr>
-          <w:t>case-study-the-pega</w:t>
-        </w:r>
-        <w:r>
-          <w:rPr>
-            <w:rStyle w:val="Hyperlink"/>
-          </w:rPr>
-          <w:t>s</w:t>
-        </w:r>
-        <w:r>
-          <w:rPr>
-            <w:rStyle w:val="Hyperlink"/>
-          </w:rPr>
-          <w:t>us-project/</w:t>
+          <w:t>https://securitylab.amnesty.org/case-study-the-pegasus-project/</w:t>
         </w:r>
       </w:hyperlink>
     </w:p>
@@ -680,7 +650,1000 @@
           <w:rPr>
             <w:rStyle w:val="Hyperlink"/>
           </w:rPr>
-          <w:t>https://www.britannica.com/topic/P</w:t>
+          <w:t>https://www.britannica.com/topic/Pegasus-spyware</w:t>
+        </w:r>
+      </w:hyperlink>
+    </w:p>
+    <w:p>
+      <w:pPr>
+        <w:pStyle w:val="ACMRef"/>
+      </w:pPr>
+      <w:hyperlink r:id="rId14" w:history="1">
+        <w:r>
+          <w:rPr>
+            <w:rStyle w:val="Hyperlink"/>
+          </w:rPr>
+          <w:t>https://www.pbs.org/wgbh/frontline/documentary/global-spyware-scandal-exposing-pegasus/</w:t>
+        </w:r>
+      </w:hyperlink>
+    </w:p>
+    <w:p>
+      <w:pPr>
+        <w:pStyle w:val="ACMRef"/>
+      </w:pPr>
+      <w:hyperlink r:id="rId15" w:history="1">
+        <w:r>
+          <w:rPr>
+            <w:rStyle w:val="Hyperlink"/>
+          </w:rPr>
+          <w:t>https://arabcenterdc.org/resource/the-full-story-behind-the-nso-hack-the-israeli-military-allied-surveillance-industry-and-transnational-repression/ (2)</w:t>
+        </w:r>
+      </w:hyperlink>
+    </w:p>
+    <w:p>
+      <w:pPr>
+        <w:pStyle w:val="ACMRef"/>
+      </w:pPr>
+    </w:p>
+    <w:p>
+      <w:pPr>
+        <w:pStyle w:val="ACMRef"/>
+      </w:pPr>
+    </w:p>
+    <w:p>
+      <w:pPr>
+        <w:pStyle w:val="Head1"/>
+        <w:tabs>
+          <w:tab w:val="clear" w:pos="360"/>
+        </w:tabs>
+        <w:ind w:left="432" w:hanging="432"/>
+      </w:pPr>
+      <w:r>
+        <w:t>response to the event:</w:t>
+      </w:r>
+    </w:p>
+    <w:p>
+      <w:pPr>
+        <w:pStyle w:val="ACMRef"/>
+        <w:ind w:firstLine="432"/>
+      </w:pPr>
+      <w:r>
+        <w:t>Describe the response / fallout to the investigation.</w:t>
+      </w:r>
+    </w:p>
+    <w:p>
+      <w:pPr>
+        <w:pStyle w:val="ACMRef"/>
+        <w:numPr>
+          <w:ilvl w:val="0"/>
+          <w:numId w:val="16"/>
+        </w:numPr>
+      </w:pPr>
+      <w:r>
+        <w:rPr>
+          <w:b/>
+          <w:bCs w:val="0"/>
+        </w:rPr>
+        <w:t>QUOTE</w:t>
+      </w:r>
+      <w:r>
+        <w:t>: “</w:t>
+      </w:r>
+      <w:r>
+        <w:t>In December 2018, Omar Abdulaziz, the friend of Jamal Khashoggi, took NSO to court in Israel. The following year, Amnesty International and even Facebook joined the growing list of plaintiffs after more than 1,500 people’s phones were revealed to have been targeted through a security flaw in the encrypted messaging service WhatsApp.</w:t>
+      </w:r>
+      <w:r>
+        <w:t>” (3)</w:t>
+      </w:r>
+    </w:p>
+    <w:p>
+      <w:pPr>
+        <w:pStyle w:val="ACMRef"/>
+        <w:numPr>
+          <w:ilvl w:val="0"/>
+          <w:numId w:val="16"/>
+        </w:numPr>
+      </w:pPr>
+      <w:r>
+        <w:rPr>
+          <w:b/>
+          <w:bCs w:val="0"/>
+        </w:rPr>
+        <w:t>QUOTE</w:t>
+      </w:r>
+      <w:r>
+        <w:t>: “</w:t>
+      </w:r>
+      <w:r>
+        <w:t>From this list, an analysis of 67 smartphones provided evidence that 37 belonging to journalists, human rights activists, business executives, and two women close to Saudi activists and </w:t>
+      </w:r>
+      <w:r>
+        <w:rPr>
+          <w:i/>
+          <w:iCs/>
+        </w:rPr>
+        <w:t>Washington Post </w:t>
+      </w:r>
+      <w:r>
+        <w:t xml:space="preserve">columnist Jamal Khashoggi were </w:t>
+      </w:r>
+      <w:r>
+        <w:lastRenderedPageBreak/>
+        <w:t>targeted or successfully infected by the Pegasus spyware. The tests for the remaining 30 were inconclusive either because phones were replaced or because Android devises do not log the needed information for the investigation.</w:t>
+      </w:r>
+      <w:r>
+        <w:t>” (2)</w:t>
+      </w:r>
+    </w:p>
+    <w:p>
+      <w:pPr>
+        <w:pStyle w:val="ACMRef"/>
+        <w:numPr>
+          <w:ilvl w:val="0"/>
+          <w:numId w:val="16"/>
+        </w:numPr>
+      </w:pPr>
+      <w:r>
+        <w:rPr>
+          <w:b/>
+          <w:bCs w:val="0"/>
+        </w:rPr>
+        <w:t>QUOTE</w:t>
+      </w:r>
+      <w:r>
+        <w:t>: “</w:t>
+      </w:r>
+      <w:r>
+        <w:t>The NSO hacking revelation, while only one piece of the puzzle, has perhaps been the most prominent due to the scale and scope of the violation as well as the </w:t>
+      </w:r>
+      <w:hyperlink r:id="rId16" w:history="1">
+        <w:r>
+          <w:rPr>
+            <w:rStyle w:val="Hyperlink"/>
+          </w:rPr>
+          <w:t>level of individuals</w:t>
+        </w:r>
+      </w:hyperlink>
+      <w:r>
+        <w:t> targeted by the Pegasus software. These included French President Emmanuel Macron, the presidents of Iraq and South Africa, Qatar’s royal family members, Morocco’s King Mohammed VI, the current prime ministers of Pakistan, Egypt, and Morocco, and seven former prime ministers. Khashoggi’s killing has gained international prominence for its brutal and lawless nature, but it also has shed light on the role of tech firms in transnational repression, as many of his family members and friends were targeted by Pegasus or hacked before and after his assassination.</w:t>
+      </w:r>
+      <w:r>
+        <w:t>” (2)</w:t>
+      </w:r>
+    </w:p>
+    <w:p>
+      <w:pPr>
+        <w:pStyle w:val="ACMRef"/>
+      </w:pPr>
+      <w:hyperlink r:id="rId17" w:history="1">
+        <w:r>
+          <w:rPr>
+            <w:rStyle w:val="Hyperlink"/>
+          </w:rPr>
+          <w:t>https://forbiddenstories.org/the-rise-and-fall-of-nso-group/ (3)</w:t>
+        </w:r>
+      </w:hyperlink>
+    </w:p>
+    <w:p>
+      <w:pPr>
+        <w:pStyle w:val="ACMRef"/>
+      </w:pPr>
+      <w:hyperlink r:id="rId18" w:history="1">
+        <w:r>
+          <w:rPr>
+            <w:rStyle w:val="Hyperlink"/>
+          </w:rPr>
+          <w:t>https://gjia.georgetown.edu/2024/09/04/cyber-mercenaries-limiting-government-use-of-commercial-spyware/</w:t>
+        </w:r>
+      </w:hyperlink>
+    </w:p>
+    <w:p>
+      <w:pPr>
+        <w:pStyle w:val="ACMRef"/>
+      </w:pPr>
+      <w:hyperlink r:id="rId19" w:history="1">
+        <w:r>
+          <w:rPr>
+            <w:rStyle w:val="Hyperlink"/>
+          </w:rPr>
+          <w:t>https://www.theguardian.com/world/2023/may/09/eu-parliament-report-calls-for-tighter-regulation-of-spyware</w:t>
+        </w:r>
+      </w:hyperlink>
+    </w:p>
+    <w:p>
+      <w:pPr>
+        <w:pStyle w:val="ACMRef"/>
+      </w:pPr>
+    </w:p>
+    <w:p>
+      <w:pPr>
+        <w:pStyle w:val="ACMRef"/>
+        <w:ind w:firstLine="432"/>
+      </w:pPr>
+    </w:p>
+    <w:p>
+      <w:pPr>
+        <w:pStyle w:val="ACMRef"/>
+        <w:ind w:firstLine="432"/>
+      </w:pPr>
+    </w:p>
+    <w:p>
+      <w:pPr>
+        <w:pStyle w:val="ACMRef"/>
+        <w:ind w:firstLine="432"/>
+      </w:pPr>
+    </w:p>
+    <w:p>
+      <w:pPr>
+        <w:pStyle w:val="ACMRef"/>
+        <w:ind w:firstLine="432"/>
+      </w:pPr>
+    </w:p>
+    <w:p>
+      <w:pPr>
+        <w:pStyle w:val="ACMRef"/>
+        <w:ind w:firstLine="432"/>
+      </w:pPr>
+    </w:p>
+    <w:p>
+      <w:pPr>
+        <w:pStyle w:val="ACMRef"/>
+        <w:ind w:firstLine="432"/>
+      </w:pPr>
+    </w:p>
+    <w:p>
+      <w:pPr>
+        <w:pStyle w:val="ACMRef"/>
+        <w:ind w:firstLine="432"/>
+      </w:pPr>
+    </w:p>
+    <w:p>
+      <w:pPr>
+        <w:pStyle w:val="ACMRef"/>
+        <w:ind w:firstLine="432"/>
+      </w:pPr>
+    </w:p>
+    <w:p>
+      <w:pPr>
+        <w:pStyle w:val="ACMRef"/>
+        <w:ind w:firstLine="432"/>
+      </w:pPr>
+    </w:p>
+    <w:p>
+      <w:pPr>
+        <w:pStyle w:val="ACMRef"/>
+        <w:ind w:firstLine="432"/>
+      </w:pPr>
+    </w:p>
+    <w:p>
+      <w:pPr>
+        <w:pStyle w:val="ACMRef"/>
+        <w:ind w:firstLine="432"/>
+      </w:pPr>
+    </w:p>
+    <w:p>
+      <w:pPr>
+        <w:pStyle w:val="ACMRef"/>
+        <w:ind w:firstLine="432"/>
+      </w:pPr>
+    </w:p>
+    <w:p>
+      <w:pPr>
+        <w:pStyle w:val="ACMRef"/>
+        <w:ind w:firstLine="432"/>
+      </w:pPr>
+    </w:p>
+    <w:p>
+      <w:pPr>
+        <w:pStyle w:val="ACMRef"/>
+        <w:ind w:firstLine="432"/>
+      </w:pPr>
+    </w:p>
+    <w:p>
+      <w:pPr>
+        <w:pStyle w:val="ACMRef"/>
+        <w:ind w:firstLine="432"/>
+      </w:pPr>
+    </w:p>
+    <w:p>
+      <w:pPr>
+        <w:pStyle w:val="ACMRef"/>
+        <w:ind w:firstLine="432"/>
+      </w:pPr>
+    </w:p>
+    <w:p>
+      <w:pPr>
+        <w:pStyle w:val="ACMRef"/>
+        <w:ind w:firstLine="432"/>
+      </w:pPr>
+    </w:p>
+    <w:p>
+      <w:pPr>
+        <w:pStyle w:val="ACMRef"/>
+        <w:ind w:firstLine="432"/>
+      </w:pPr>
+    </w:p>
+    <w:p>
+      <w:pPr>
+        <w:pStyle w:val="ACMRef"/>
+        <w:ind w:firstLine="432"/>
+      </w:pPr>
+    </w:p>
+    <w:p>
+      <w:pPr>
+        <w:pStyle w:val="ACMRef"/>
+        <w:ind w:firstLine="432"/>
+      </w:pPr>
+    </w:p>
+    <w:p>
+      <w:pPr>
+        <w:pStyle w:val="ACMRef"/>
+        <w:ind w:firstLine="432"/>
+      </w:pPr>
+    </w:p>
+    <w:p>
+      <w:pPr>
+        <w:pStyle w:val="ACMRef"/>
+        <w:ind w:firstLine="432"/>
+      </w:pPr>
+    </w:p>
+    <w:p>
+      <w:pPr>
+        <w:pStyle w:val="ACMRef"/>
+        <w:ind w:firstLine="432"/>
+      </w:pPr>
+    </w:p>
+    <w:p>
+      <w:pPr>
+        <w:pStyle w:val="ACMRef"/>
+        <w:ind w:firstLine="432"/>
+      </w:pPr>
+    </w:p>
+    <w:p>
+      <w:pPr>
+        <w:pStyle w:val="ACMRef"/>
+        <w:ind w:firstLine="432"/>
+      </w:pPr>
+    </w:p>
+    <w:p>
+      <w:pPr>
+        <w:pStyle w:val="ACMRef"/>
+        <w:ind w:firstLine="432"/>
+      </w:pPr>
+    </w:p>
+    <w:p>
+      <w:pPr>
+        <w:pStyle w:val="ACMRef"/>
+        <w:ind w:firstLine="432"/>
+      </w:pPr>
+    </w:p>
+    <w:p>
+      <w:pPr>
+        <w:pStyle w:val="ACMRef"/>
+        <w:ind w:firstLine="432"/>
+      </w:pPr>
+    </w:p>
+    <w:p>
+      <w:pPr>
+        <w:pStyle w:val="ACMRef"/>
+        <w:ind w:firstLine="432"/>
+      </w:pPr>
+    </w:p>
+    <w:p>
+      <w:pPr>
+        <w:pStyle w:val="ACMRef"/>
+        <w:ind w:firstLine="432"/>
+      </w:pPr>
+    </w:p>
+    <w:p>
+      <w:pPr>
+        <w:pStyle w:val="ACMRef"/>
+        <w:ind w:firstLine="432"/>
+      </w:pPr>
+    </w:p>
+    <w:p>
+      <w:pPr>
+        <w:pStyle w:val="ACMRef"/>
+        <w:ind w:firstLine="432"/>
+      </w:pPr>
+    </w:p>
+    <w:p>
+      <w:pPr>
+        <w:pStyle w:val="ACMRef"/>
+        <w:ind w:firstLine="432"/>
+      </w:pPr>
+    </w:p>
+    <w:p>
+      <w:pPr>
+        <w:pStyle w:val="ACMRef"/>
+        <w:ind w:firstLine="432"/>
+      </w:pPr>
+    </w:p>
+    <w:p>
+      <w:pPr>
+        <w:pStyle w:val="ACMRef"/>
+        <w:ind w:firstLine="432"/>
+      </w:pPr>
+    </w:p>
+    <w:p>
+      <w:pPr>
+        <w:pStyle w:val="ACMRef"/>
+        <w:ind w:firstLine="432"/>
+      </w:pPr>
+    </w:p>
+    <w:p>
+      <w:pPr>
+        <w:pStyle w:val="ACMRef"/>
+        <w:ind w:firstLine="432"/>
+      </w:pPr>
+    </w:p>
+    <w:p>
+      <w:pPr>
+        <w:pStyle w:val="ACMRef"/>
+        <w:ind w:firstLine="432"/>
+      </w:pPr>
+    </w:p>
+    <w:p>
+      <w:pPr>
+        <w:pStyle w:val="ACMRef"/>
+        <w:ind w:firstLine="432"/>
+      </w:pPr>
+    </w:p>
+    <w:p>
+      <w:pPr>
+        <w:pStyle w:val="ACMRef"/>
+        <w:ind w:firstLine="432"/>
+      </w:pPr>
+    </w:p>
+    <w:p>
+      <w:pPr>
+        <w:pStyle w:val="ACMRef"/>
+        <w:ind w:firstLine="432"/>
+      </w:pPr>
+    </w:p>
+    <w:p>
+      <w:pPr>
+        <w:pStyle w:val="ACMRef"/>
+        <w:ind w:firstLine="432"/>
+      </w:pPr>
+    </w:p>
+    <w:p>
+      <w:pPr>
+        <w:pStyle w:val="Head1"/>
+        <w:tabs>
+          <w:tab w:val="clear" w:pos="360"/>
+        </w:tabs>
+        <w:ind w:left="432" w:hanging="432"/>
+      </w:pPr>
+      <w:r>
+        <w:t>technical details:</w:t>
+      </w:r>
+    </w:p>
+    <w:p>
+      <w:pPr>
+        <w:pStyle w:val="Para"/>
+        <w:rPr>
+          <w:lang w:eastAsia="en-US"/>
+        </w:rPr>
+      </w:pPr>
+      <w:r>
+        <w:rPr>
+          <w:lang w:eastAsia="en-US"/>
+        </w:rPr>
+        <w:t>This is the most important section for us, as computer scientists, to understand and elucidate.</w:t>
+      </w:r>
+    </w:p>
+    <w:p>
+      <w:pPr>
+        <w:pStyle w:val="Para"/>
+        <w:rPr>
+          <w:lang w:eastAsia="en-US"/>
+        </w:rPr>
+      </w:pPr>
+      <w:r>
+        <w:rPr>
+          <w:lang w:eastAsia="en-US"/>
+        </w:rPr>
+        <w:t xml:space="preserve">• How does Pegasus, or software </w:t>
+      </w:r>
+      <w:proofErr w:type="gramStart"/>
+      <w:r>
+        <w:rPr>
+          <w:lang w:eastAsia="en-US"/>
+        </w:rPr>
+        <w:t>similar to</w:t>
+      </w:r>
+      <w:proofErr w:type="gramEnd"/>
+      <w:r>
+        <w:rPr>
+          <w:lang w:eastAsia="en-US"/>
+        </w:rPr>
+        <w:t xml:space="preserve"> it, infect a phone without the user’s input?</w:t>
+      </w:r>
+    </w:p>
+    <w:p>
+      <w:pPr>
+        <w:pStyle w:val="ParaContinue"/>
+        <w:numPr>
+          <w:ilvl w:val="0"/>
+          <w:numId w:val="16"/>
+        </w:numPr>
+        <w:rPr>
+          <w:lang w:eastAsia="en-US"/>
+        </w:rPr>
+      </w:pPr>
+      <w:r>
+        <w:rPr>
+          <w:b/>
+          <w:bCs/>
+          <w:lang w:eastAsia="en-US"/>
+        </w:rPr>
+        <w:t>QUOTE</w:t>
+      </w:r>
+      <w:r>
+        <w:rPr>
+          <w:lang w:eastAsia="en-US"/>
+        </w:rPr>
+        <w:t>: “</w:t>
+      </w:r>
+      <w:r>
+        <w:rPr>
+          <w:lang w:eastAsia="en-US"/>
+        </w:rPr>
+        <w:t>Citizen Lab was able to recover these Pegasus exploits from an iPhone and therefore this analysis covers NSO's capabilities against iPhone.</w:t>
+      </w:r>
+      <w:r>
+        <w:rPr>
+          <w:lang w:eastAsia="en-US"/>
+        </w:rPr>
+        <w:t>” (5)</w:t>
+      </w:r>
+    </w:p>
+    <w:p>
+      <w:pPr>
+        <w:pStyle w:val="ParaContinue"/>
+        <w:numPr>
+          <w:ilvl w:val="0"/>
+          <w:numId w:val="16"/>
+        </w:numPr>
+        <w:rPr>
+          <w:lang w:eastAsia="en-US"/>
+        </w:rPr>
+      </w:pPr>
+      <w:r>
+        <w:rPr>
+          <w:b/>
+          <w:bCs/>
+          <w:lang w:eastAsia="en-US"/>
+        </w:rPr>
+        <w:t>QUOTE</w:t>
+      </w:r>
+      <w:r>
+        <w:rPr>
+          <w:lang w:eastAsia="en-US"/>
+        </w:rPr>
+        <w:t>: “</w:t>
+      </w:r>
+      <w:r>
+        <w:rPr>
+          <w:lang w:eastAsia="en-US"/>
+        </w:rPr>
+        <w:t xml:space="preserve">The initial entry point for Pegasus on iPhone is iMessage. This means that a victim can be targeted </w:t>
+      </w:r>
+      <w:proofErr w:type="gramStart"/>
+      <w:r>
+        <w:rPr>
+          <w:lang w:eastAsia="en-US"/>
+        </w:rPr>
+        <w:t>just</w:t>
+      </w:r>
+      <w:proofErr w:type="gramEnd"/>
+      <w:r>
+        <w:rPr>
+          <w:lang w:eastAsia="en-US"/>
+        </w:rPr>
+        <w:t xml:space="preserve"> using their phone number or </w:t>
+      </w:r>
+      <w:proofErr w:type="spellStart"/>
+      <w:r>
+        <w:rPr>
+          <w:lang w:eastAsia="en-US"/>
+        </w:rPr>
+        <w:t>AppleID</w:t>
+      </w:r>
+      <w:proofErr w:type="spellEnd"/>
+      <w:r>
+        <w:rPr>
+          <w:lang w:eastAsia="en-US"/>
+        </w:rPr>
+        <w:t xml:space="preserve"> </w:t>
+      </w:r>
+      <w:proofErr w:type="gramStart"/>
+      <w:r>
+        <w:rPr>
+          <w:lang w:eastAsia="en-US"/>
+        </w:rPr>
+        <w:t>username.</w:t>
+      </w:r>
+      <w:r>
+        <w:rPr>
+          <w:lang w:eastAsia="en-US"/>
+        </w:rPr>
+        <w:t>”</w:t>
+      </w:r>
+      <w:proofErr w:type="gramEnd"/>
+      <w:r>
+        <w:rPr>
+          <w:lang w:eastAsia="en-US"/>
+        </w:rPr>
+        <w:t xml:space="preserve"> (5)</w:t>
+      </w:r>
+    </w:p>
+    <w:p>
+      <w:pPr>
+        <w:pStyle w:val="ParaContinue"/>
+        <w:numPr>
+          <w:ilvl w:val="0"/>
+          <w:numId w:val="16"/>
+        </w:numPr>
+        <w:rPr>
+          <w:lang w:eastAsia="en-US"/>
+        </w:rPr>
+      </w:pPr>
+      <w:r>
+        <w:rPr>
+          <w:b/>
+          <w:bCs/>
+          <w:lang w:eastAsia="en-US"/>
+        </w:rPr>
+        <w:t>QUOTE</w:t>
+      </w:r>
+      <w:r>
+        <w:rPr>
+          <w:lang w:eastAsia="en-US"/>
+        </w:rPr>
+        <w:t>:</w:t>
+      </w:r>
+      <w:r>
+        <w:rPr>
+          <w:lang w:eastAsia="en-US"/>
+        </w:rPr>
+        <w:t xml:space="preserve"> “</w:t>
+      </w:r>
+      <w:proofErr w:type="spellStart"/>
+      <w:r>
+        <w:rPr>
+          <w:lang w:eastAsia="en-US"/>
+        </w:rPr>
+        <w:t>BlastDoor</w:t>
+      </w:r>
+      <w:proofErr w:type="spellEnd"/>
+      <w:r>
+        <w:rPr>
+          <w:lang w:eastAsia="en-US"/>
+        </w:rPr>
+        <w:t xml:space="preserve"> isolates, parses, transcodes, and validates untrusted data arriving in Messages, IDS and other vectors to help prevent attacks.</w:t>
+      </w:r>
+      <w:r>
+        <w:rPr>
+          <w:lang w:eastAsia="en-US"/>
+        </w:rPr>
+        <w:t>” (6)</w:t>
+      </w:r>
+    </w:p>
+    <w:p>
+      <w:pPr>
+        <w:pStyle w:val="ParaContinue"/>
+        <w:numPr>
+          <w:ilvl w:val="0"/>
+          <w:numId w:val="16"/>
+        </w:numPr>
+        <w:rPr>
+          <w:lang w:eastAsia="en-US"/>
+        </w:rPr>
+      </w:pPr>
+      <w:r>
+        <w:rPr>
+          <w:b/>
+          <w:bCs/>
+          <w:lang w:eastAsia="en-US"/>
+        </w:rPr>
+        <w:t>QUOTE</w:t>
+      </w:r>
+      <w:r>
+        <w:rPr>
+          <w:lang w:eastAsia="en-US"/>
+        </w:rPr>
+        <w:t>:</w:t>
+      </w:r>
+      <w:r>
+        <w:rPr>
+          <w:lang w:eastAsia="en-US"/>
+        </w:rPr>
+        <w:t xml:space="preserve"> “</w:t>
+      </w:r>
+      <w:r>
+        <w:rPr>
+          <w:lang w:eastAsia="en-US"/>
+        </w:rPr>
+        <w:t>Apple wanted to make those GIFs loop endlessly rather than only play once, so very early on in the </w:t>
+      </w:r>
+      <w:hyperlink r:id="rId20" w:history="1">
+        <w:r>
+          <w:rPr>
+            <w:rStyle w:val="Hyperlink"/>
+            <w:lang w:eastAsia="en-US"/>
+          </w:rPr>
+          <w:t>iMessage parsing and processing pipeline</w:t>
+        </w:r>
+      </w:hyperlink>
+      <w:r>
+        <w:rPr>
+          <w:lang w:eastAsia="en-US"/>
+        </w:rPr>
+        <w:t> (after a message has been received but well before the message is shown), iMessage calls the following method in the </w:t>
+      </w:r>
+      <w:proofErr w:type="spellStart"/>
+      <w:r>
+        <w:rPr>
+          <w:lang w:eastAsia="en-US"/>
+        </w:rPr>
+        <w:t>IMTranscoderAgent</w:t>
+      </w:r>
+      <w:proofErr w:type="spellEnd"/>
+      <w:r>
+        <w:rPr>
+          <w:lang w:eastAsia="en-US"/>
+        </w:rPr>
+        <w:t> process (outside the "</w:t>
+      </w:r>
+      <w:proofErr w:type="spellStart"/>
+      <w:r>
+        <w:rPr>
+          <w:lang w:eastAsia="en-US"/>
+        </w:rPr>
+        <w:t>BlastDoor</w:t>
+      </w:r>
+      <w:proofErr w:type="spellEnd"/>
+      <w:r>
+        <w:rPr>
+          <w:lang w:eastAsia="en-US"/>
+        </w:rPr>
+        <w:t>" sandbox), passing any image file received with the extension .gif</w:t>
+      </w:r>
+      <w:r>
+        <w:rPr>
+          <w:lang w:eastAsia="en-US"/>
+        </w:rPr>
+        <w:t>” (5)</w:t>
+      </w:r>
+    </w:p>
+    <w:p>
+      <w:pPr>
+        <w:pStyle w:val="ParaContinue"/>
+        <w:numPr>
+          <w:ilvl w:val="0"/>
+          <w:numId w:val="16"/>
+        </w:numPr>
+        <w:rPr>
+          <w:lang w:eastAsia="en-US"/>
+        </w:rPr>
+      </w:pPr>
+      <w:r>
+        <w:rPr>
+          <w:b/>
+          <w:bCs/>
+          <w:lang w:eastAsia="en-US"/>
+        </w:rPr>
+        <w:t>QUOTE</w:t>
+      </w:r>
+      <w:r>
+        <w:rPr>
+          <w:lang w:eastAsia="en-US"/>
+        </w:rPr>
+        <w:t>: “</w:t>
+      </w:r>
+      <w:r>
+        <w:rPr>
+          <w:lang w:eastAsia="en-US"/>
+        </w:rPr>
+        <w:t xml:space="preserve">The </w:t>
+      </w:r>
+      <w:proofErr w:type="spellStart"/>
+      <w:r>
+        <w:rPr>
+          <w:lang w:eastAsia="en-US"/>
+        </w:rPr>
+        <w:t>ImageIO</w:t>
+      </w:r>
+      <w:proofErr w:type="spellEnd"/>
+      <w:r>
+        <w:rPr>
+          <w:lang w:eastAsia="en-US"/>
+        </w:rPr>
+        <w:t xml:space="preserve"> library, </w:t>
+      </w:r>
+      <w:hyperlink r:id="rId21" w:history="1">
+        <w:r>
+          <w:rPr>
+            <w:rStyle w:val="Hyperlink"/>
+            <w:lang w:eastAsia="en-US"/>
+          </w:rPr>
+          <w:t>as detailed in a previous Project Zero blogpost</w:t>
+        </w:r>
+      </w:hyperlink>
+      <w:r>
+        <w:rPr>
+          <w:lang w:eastAsia="en-US"/>
+        </w:rPr>
+        <w:t>, is used to guess the correct format of the source file and parse it, completely ignoring the file extension.</w:t>
+      </w:r>
+      <w:r>
+        <w:rPr>
+          <w:lang w:eastAsia="en-US"/>
+        </w:rPr>
+        <w:t>” (5)</w:t>
+      </w:r>
+    </w:p>
+    <w:p>
+      <w:pPr>
+        <w:pStyle w:val="ParaContinue"/>
+        <w:numPr>
+          <w:ilvl w:val="0"/>
+          <w:numId w:val="16"/>
+        </w:numPr>
+        <w:rPr>
+          <w:lang w:eastAsia="en-US"/>
+        </w:rPr>
+      </w:pPr>
+      <w:r>
+        <w:rPr>
+          <w:b/>
+          <w:bCs/>
+          <w:lang w:eastAsia="en-US"/>
+        </w:rPr>
+        <w:t>QUOTE</w:t>
+      </w:r>
+      <w:r>
+        <w:rPr>
+          <w:lang w:eastAsia="en-US"/>
+        </w:rPr>
+        <w:t>: “</w:t>
+      </w:r>
+      <w:r>
+        <w:rPr>
+          <w:lang w:eastAsia="en-US"/>
+        </w:rPr>
+        <w:t>The PDFs files produced by those scanners were exceptionally small, perhaps only a few kilobytes.</w:t>
+      </w:r>
+      <w:r>
+        <w:rPr>
+          <w:lang w:eastAsia="en-US"/>
+        </w:rPr>
+        <w:t>” (5)</w:t>
+      </w:r>
+    </w:p>
+    <w:p>
+      <w:pPr>
+        <w:pStyle w:val="ParaContinue"/>
+        <w:numPr>
+          <w:ilvl w:val="0"/>
+          <w:numId w:val="16"/>
+        </w:numPr>
+        <w:rPr>
+          <w:lang w:eastAsia="en-US"/>
+        </w:rPr>
+      </w:pPr>
+    </w:p>
+    <w:p>
+      <w:pPr>
+        <w:pStyle w:val="ParaContinue"/>
+        <w:rPr>
+          <w:lang w:eastAsia="en-US"/>
+        </w:rPr>
+      </w:pPr>
+    </w:p>
+    <w:p>
+      <w:pPr>
+        <w:pStyle w:val="Para"/>
+        <w:rPr>
+          <w:lang w:eastAsia="en-US"/>
+        </w:rPr>
+      </w:pPr>
+      <w:r>
+        <w:rPr>
+          <w:lang w:eastAsia="en-US"/>
+        </w:rPr>
+        <w:t>• What are the technical underpinnings of the algorithms required to implement such an attack?</w:t>
+      </w:r>
+    </w:p>
+    <w:p>
+      <w:pPr>
+        <w:pStyle w:val="ParaContinue"/>
+        <w:rPr>
+          <w:lang w:eastAsia="en-US"/>
+        </w:rPr>
+      </w:pPr>
+    </w:p>
+    <w:p>
+      <w:pPr>
+        <w:pStyle w:val="Para"/>
+        <w:rPr>
+          <w:lang w:eastAsia="en-US"/>
+        </w:rPr>
+      </w:pPr>
+      <w:r>
+        <w:rPr>
+          <w:lang w:eastAsia="en-US"/>
+        </w:rPr>
+        <w:t>• How would we counter, or prevent, such an attack in our code?</w:t>
+      </w:r>
+    </w:p>
+    <w:p>
+      <w:pPr>
+        <w:pStyle w:val="ParaContinue"/>
+        <w:rPr>
+          <w:lang w:eastAsia="en-US"/>
+        </w:rPr>
+      </w:pPr>
+    </w:p>
+    <w:p>
+      <w:pPr>
+        <w:pStyle w:val="ACMRef"/>
+      </w:pPr>
+      <w:r>
+        <w:t>Provide a detailed description - use pseudo-code, block diagrams, and other necessary means to convey your research and analysis.</w:t>
+      </w:r>
+    </w:p>
+    <w:p>
+      <w:pPr>
+        <w:pStyle w:val="ACMRef"/>
+      </w:pPr>
+      <w:hyperlink r:id="rId22" w:history="1">
+        <w:r>
+          <w:rPr>
+            <w:rStyle w:val="Hyperlink"/>
+          </w:rPr>
+          <w:t>https://www.amnesty.org/en/latest/research/2021/07/forensic-methodology-report-how-to-catch-nso-groups-pegasus/</w:t>
+        </w:r>
+      </w:hyperlink>
+    </w:p>
+    <w:p>
+      <w:pPr>
+        <w:pStyle w:val="ACMRef"/>
+      </w:pPr>
+      <w:hyperlink r:id="rId23" w:history="1">
+        <w:r>
+          <w:rPr>
+            <w:rStyle w:val="Hyperlink"/>
+          </w:rPr>
+          <w:t>https://en.wikipedia.org/wiki/Pegasus_(spyware)</w:t>
+        </w:r>
+      </w:hyperlink>
+    </w:p>
+    <w:p>
+      <w:pPr>
+        <w:pStyle w:val="ACMRef"/>
+      </w:pPr>
+      <w:hyperlink r:id="rId24" w:history="1">
+        <w:r>
+          <w:rPr>
+            <w:rStyle w:val="Hyperlink"/>
+          </w:rPr>
+          <w:t>https://ijclinic.law.uci.edu/clipping-pegasuss-wings/basics-of-pegasus/</w:t>
+        </w:r>
+      </w:hyperlink>
+    </w:p>
+    <w:p>
+      <w:pPr>
+        <w:pStyle w:val="ACMRef"/>
+      </w:pPr>
+      <w:hyperlink r:id="rId25" w:history="1">
+        <w:r>
+          <w:rPr>
+            <w:rStyle w:val="Hyperlink"/>
+          </w:rPr>
+          <w:t>https://www.ge</w:t>
         </w:r>
         <w:r>
           <w:rPr>
@@ -692,7 +1655,7 @@
           <w:rPr>
             <w:rStyle w:val="Hyperlink"/>
           </w:rPr>
-          <w:t>gasus-spyware</w:t>
+          <w:t>ksforgeeks.org/blogs/what-is-pegasus-spyware-and-how-it-works/</w:t>
         </w:r>
       </w:hyperlink>
     </w:p>
@@ -700,659 +1663,7 @@
       <w:pPr>
         <w:pStyle w:val="ACMRef"/>
       </w:pPr>
-      <w:hyperlink r:id="rId14" w:history="1">
-        <w:r>
-          <w:rPr>
-            <w:rStyle w:val="Hyperlink"/>
-          </w:rPr>
-          <w:t>https://www.pbs.org/wgbh/fr</w:t>
-        </w:r>
-        <w:r>
-          <w:rPr>
-            <w:rStyle w:val="Hyperlink"/>
-          </w:rPr>
-          <w:t>o</w:t>
-        </w:r>
-        <w:r>
-          <w:rPr>
-            <w:rStyle w:val="Hyperlink"/>
-          </w:rPr>
-          <w:t>n</w:t>
-        </w:r>
-        <w:r>
-          <w:rPr>
-            <w:rStyle w:val="Hyperlink"/>
-          </w:rPr>
-          <w:t>tline/d</w:t>
-        </w:r>
-        <w:r>
-          <w:rPr>
-            <w:rStyle w:val="Hyperlink"/>
-          </w:rPr>
-          <w:t>o</w:t>
-        </w:r>
-        <w:r>
-          <w:rPr>
-            <w:rStyle w:val="Hyperlink"/>
-          </w:rPr>
-          <w:t>cumentary/global-spyware-scandal-exposing-pegasus/</w:t>
-        </w:r>
-      </w:hyperlink>
-    </w:p>
-    <w:p>
-      <w:pPr>
-        <w:pStyle w:val="ACMRef"/>
-      </w:pPr>
-      <w:hyperlink r:id="rId15" w:history="1">
-        <w:r>
-          <w:rPr>
-            <w:rStyle w:val="Hyperlink"/>
-          </w:rPr>
-          <w:t>https://arabcenterdc.org/resource/the-full-story-behind-the-nso-hack-the-israeli-military-allied-surveillance-industry-and-transnational-repression/ (2)</w:t>
-        </w:r>
-      </w:hyperlink>
-    </w:p>
-    <w:p>
-      <w:pPr>
-        <w:pStyle w:val="ACMRef"/>
-      </w:pPr>
-    </w:p>
-    <w:p>
-      <w:pPr>
-        <w:pStyle w:val="ACMRef"/>
-      </w:pPr>
-    </w:p>
-    <w:p>
-      <w:pPr>
-        <w:pStyle w:val="Head1"/>
-        <w:tabs>
-          <w:tab w:val="clear" w:pos="360"/>
-        </w:tabs>
-        <w:ind w:left="432" w:hanging="432"/>
-      </w:pPr>
-      <w:r>
-        <w:t>response to the event:</w:t>
-      </w:r>
-    </w:p>
-    <w:p>
-      <w:pPr>
-        <w:pStyle w:val="ACMRef"/>
-        <w:ind w:firstLine="432"/>
-      </w:pPr>
-      <w:r>
-        <w:t>Describe the response / fallout to the investigation.</w:t>
-      </w:r>
-    </w:p>
-    <w:p>
-      <w:pPr>
-        <w:pStyle w:val="ACMRef"/>
-        <w:numPr>
-          <w:ilvl w:val="0"/>
-          <w:numId w:val="16"/>
-        </w:numPr>
-      </w:pPr>
-      <w:r>
-        <w:rPr>
-          <w:b/>
-          <w:bCs w:val="0"/>
-        </w:rPr>
-        <w:t>QUOTE</w:t>
-      </w:r>
-      <w:r>
-        <w:t>: “</w:t>
-      </w:r>
-      <w:r>
-        <w:t>In December 2018, Omar Abdulaziz, the friend of Jamal Khashoggi, took NSO to court in Israel. The following year, Amnesty International and even Facebook joined the growing list of plaintiffs after more than 1,500 people’s phones were revealed to have been targeted through a security flaw in the encrypted messaging service WhatsApp.</w:t>
-      </w:r>
-      <w:r>
-        <w:t>” (3)</w:t>
-      </w:r>
-    </w:p>
-    <w:p>
-      <w:pPr>
-        <w:pStyle w:val="ACMRef"/>
-        <w:numPr>
-          <w:ilvl w:val="0"/>
-          <w:numId w:val="16"/>
-        </w:numPr>
-      </w:pPr>
-      <w:r>
-        <w:rPr>
-          <w:b/>
-          <w:bCs w:val="0"/>
-        </w:rPr>
-        <w:t>QUOTE</w:t>
-      </w:r>
-      <w:r>
-        <w:t>: “</w:t>
-      </w:r>
-      <w:r>
-        <w:t>From this list, an analysis of 67 smartphones provided evidence that 37 belonging to journalists, human rights activists, business executives, and two women close to Saudi activists and </w:t>
-      </w:r>
-      <w:r>
-        <w:rPr>
-          <w:i/>
-          <w:iCs/>
-        </w:rPr>
-        <w:t>Washington Post </w:t>
-      </w:r>
-      <w:r>
-        <w:t xml:space="preserve">columnist Jamal Khashoggi were </w:t>
-      </w:r>
-      <w:r>
-        <w:lastRenderedPageBreak/>
-        <w:t>targeted or successfully infected by the Pegasus spyware. The tests for the remaining 30 were inconclusive either because phones were replaced or because Android devises do not log the needed information for the investigation.</w:t>
-      </w:r>
-      <w:r>
-        <w:t>” (2)</w:t>
-      </w:r>
-    </w:p>
-    <w:p>
-      <w:pPr>
-        <w:pStyle w:val="ACMRef"/>
-        <w:numPr>
-          <w:ilvl w:val="0"/>
-          <w:numId w:val="16"/>
-        </w:numPr>
-      </w:pPr>
-      <w:r>
-        <w:rPr>
-          <w:b/>
-          <w:bCs w:val="0"/>
-        </w:rPr>
-        <w:t>QUOTE</w:t>
-      </w:r>
-      <w:r>
-        <w:t>: “</w:t>
-      </w:r>
-      <w:r>
-        <w:t>The NSO hacking revelation, while only one piece of the puzzle, has perhaps been the most prominent due to the scale and scope of the violation as well as the </w:t>
-      </w:r>
-      <w:hyperlink r:id="rId16" w:history="1">
-        <w:r>
-          <w:rPr>
-            <w:rStyle w:val="Hyperlink"/>
-          </w:rPr>
-          <w:t>level of individuals</w:t>
-        </w:r>
-      </w:hyperlink>
-      <w:r>
-        <w:t> targeted by the Pegasus software. These included French President Emmanuel Macron, the presidents of Iraq and South Africa, Qatar’s royal family members, Morocco’s King Mohammed VI, the current prime ministers of Pakistan, Egypt, and Morocco, and seven former prime ministers. Khashoggi’s killing has gained international prominence for its brutal and lawless nature, but it also has shed light on the role of tech firms in transnational repression, as many of his family members and friends were targeted by Pegasus or hacked before and after his assassination.</w:t>
-      </w:r>
-      <w:r>
-        <w:t>”</w:t>
-      </w:r>
-      <w:r>
-        <w:t xml:space="preserve"> (2)</w:t>
-      </w:r>
-    </w:p>
-    <w:p>
-      <w:pPr>
-        <w:pStyle w:val="ACMRef"/>
-      </w:pPr>
-      <w:hyperlink r:id="rId17" w:history="1">
-        <w:r>
-          <w:rPr>
-            <w:rStyle w:val="Hyperlink"/>
-          </w:rPr>
-          <w:t>https://forbiddenstories.org/the-rise-and-fall-of-nso-group/ (3)</w:t>
-        </w:r>
-      </w:hyperlink>
-    </w:p>
-    <w:p>
-      <w:pPr>
-        <w:pStyle w:val="ACMRef"/>
-      </w:pPr>
-      <w:hyperlink r:id="rId18" w:history="1">
-        <w:r>
-          <w:rPr>
-            <w:rStyle w:val="Hyperlink"/>
-          </w:rPr>
-          <w:t>https://gjia.georgetown.edu/2024/09/04/cyber-mercenaries-limiting-government-use-of-commercial-spyware/</w:t>
-        </w:r>
-      </w:hyperlink>
-    </w:p>
-    <w:p>
-      <w:pPr>
-        <w:pStyle w:val="ACMRef"/>
-      </w:pPr>
-      <w:hyperlink r:id="rId19" w:history="1">
-        <w:r>
-          <w:rPr>
-            <w:rStyle w:val="Hyperlink"/>
-          </w:rPr>
-          <w:t>https://www.theguardian.com/world/2023/may/09/eu-parliament-report-calls-for-tighter-regulation-of-spyware</w:t>
-        </w:r>
-      </w:hyperlink>
-    </w:p>
-    <w:p>
-      <w:pPr>
-        <w:pStyle w:val="ACMRef"/>
-      </w:pPr>
-    </w:p>
-    <w:p>
-      <w:pPr>
-        <w:pStyle w:val="ACMRef"/>
-        <w:ind w:firstLine="432"/>
-      </w:pPr>
-    </w:p>
-    <w:p>
-      <w:pPr>
-        <w:pStyle w:val="ACMRef"/>
-        <w:ind w:firstLine="432"/>
-      </w:pPr>
-    </w:p>
-    <w:p>
-      <w:pPr>
-        <w:pStyle w:val="ACMRef"/>
-        <w:ind w:firstLine="432"/>
-      </w:pPr>
-    </w:p>
-    <w:p>
-      <w:pPr>
-        <w:pStyle w:val="ACMRef"/>
-        <w:ind w:firstLine="432"/>
-      </w:pPr>
-    </w:p>
-    <w:p>
-      <w:pPr>
-        <w:pStyle w:val="ACMRef"/>
-        <w:ind w:firstLine="432"/>
-      </w:pPr>
-    </w:p>
-    <w:p>
-      <w:pPr>
-        <w:pStyle w:val="ACMRef"/>
-        <w:ind w:firstLine="432"/>
-      </w:pPr>
-    </w:p>
-    <w:p>
-      <w:pPr>
-        <w:pStyle w:val="ACMRef"/>
-        <w:ind w:firstLine="432"/>
-      </w:pPr>
-    </w:p>
-    <w:p>
-      <w:pPr>
-        <w:pStyle w:val="ACMRef"/>
-        <w:ind w:firstLine="432"/>
-      </w:pPr>
-    </w:p>
-    <w:p>
-      <w:pPr>
-        <w:pStyle w:val="ACMRef"/>
-        <w:ind w:firstLine="432"/>
-      </w:pPr>
-    </w:p>
-    <w:p>
-      <w:pPr>
-        <w:pStyle w:val="ACMRef"/>
-        <w:ind w:firstLine="432"/>
-      </w:pPr>
-    </w:p>
-    <w:p>
-      <w:pPr>
-        <w:pStyle w:val="ACMRef"/>
-        <w:ind w:firstLine="432"/>
-      </w:pPr>
-    </w:p>
-    <w:p>
-      <w:pPr>
-        <w:pStyle w:val="ACMRef"/>
-        <w:ind w:firstLine="432"/>
-      </w:pPr>
-    </w:p>
-    <w:p>
-      <w:pPr>
-        <w:pStyle w:val="ACMRef"/>
-        <w:ind w:firstLine="432"/>
-      </w:pPr>
-    </w:p>
-    <w:p>
-      <w:pPr>
-        <w:pStyle w:val="ACMRef"/>
-        <w:ind w:firstLine="432"/>
-      </w:pPr>
-    </w:p>
-    <w:p>
-      <w:pPr>
-        <w:pStyle w:val="ACMRef"/>
-        <w:ind w:firstLine="432"/>
-      </w:pPr>
-    </w:p>
-    <w:p>
-      <w:pPr>
-        <w:pStyle w:val="ACMRef"/>
-        <w:ind w:firstLine="432"/>
-      </w:pPr>
-    </w:p>
-    <w:p>
-      <w:pPr>
-        <w:pStyle w:val="ACMRef"/>
-        <w:ind w:firstLine="432"/>
-      </w:pPr>
-    </w:p>
-    <w:p>
-      <w:pPr>
-        <w:pStyle w:val="ACMRef"/>
-        <w:ind w:firstLine="432"/>
-      </w:pPr>
-    </w:p>
-    <w:p>
-      <w:pPr>
-        <w:pStyle w:val="ACMRef"/>
-        <w:ind w:firstLine="432"/>
-      </w:pPr>
-    </w:p>
-    <w:p>
-      <w:pPr>
-        <w:pStyle w:val="ACMRef"/>
-        <w:ind w:firstLine="432"/>
-      </w:pPr>
-    </w:p>
-    <w:p>
-      <w:pPr>
-        <w:pStyle w:val="ACMRef"/>
-        <w:ind w:firstLine="432"/>
-      </w:pPr>
-    </w:p>
-    <w:p>
-      <w:pPr>
-        <w:pStyle w:val="ACMRef"/>
-        <w:ind w:firstLine="432"/>
-      </w:pPr>
-    </w:p>
-    <w:p>
-      <w:pPr>
-        <w:pStyle w:val="ACMRef"/>
-        <w:ind w:firstLine="432"/>
-      </w:pPr>
-    </w:p>
-    <w:p>
-      <w:pPr>
-        <w:pStyle w:val="ACMRef"/>
-        <w:ind w:firstLine="432"/>
-      </w:pPr>
-    </w:p>
-    <w:p>
-      <w:pPr>
-        <w:pStyle w:val="ACMRef"/>
-        <w:ind w:firstLine="432"/>
-      </w:pPr>
-    </w:p>
-    <w:p>
-      <w:pPr>
-        <w:pStyle w:val="ACMRef"/>
-        <w:ind w:firstLine="432"/>
-      </w:pPr>
-    </w:p>
-    <w:p>
-      <w:pPr>
-        <w:pStyle w:val="ACMRef"/>
-        <w:ind w:firstLine="432"/>
-      </w:pPr>
-    </w:p>
-    <w:p>
-      <w:pPr>
-        <w:pStyle w:val="ACMRef"/>
-        <w:ind w:firstLine="432"/>
-      </w:pPr>
-    </w:p>
-    <w:p>
-      <w:pPr>
-        <w:pStyle w:val="ACMRef"/>
-        <w:ind w:firstLine="432"/>
-      </w:pPr>
-    </w:p>
-    <w:p>
-      <w:pPr>
-        <w:pStyle w:val="ACMRef"/>
-        <w:ind w:firstLine="432"/>
-      </w:pPr>
-    </w:p>
-    <w:p>
-      <w:pPr>
-        <w:pStyle w:val="ACMRef"/>
-        <w:ind w:firstLine="432"/>
-      </w:pPr>
-    </w:p>
-    <w:p>
-      <w:pPr>
-        <w:pStyle w:val="ACMRef"/>
-        <w:ind w:firstLine="432"/>
-      </w:pPr>
-    </w:p>
-    <w:p>
-      <w:pPr>
-        <w:pStyle w:val="ACMRef"/>
-        <w:ind w:firstLine="432"/>
-      </w:pPr>
-    </w:p>
-    <w:p>
-      <w:pPr>
-        <w:pStyle w:val="ACMRef"/>
-        <w:ind w:firstLine="432"/>
-      </w:pPr>
-    </w:p>
-    <w:p>
-      <w:pPr>
-        <w:pStyle w:val="ACMRef"/>
-        <w:ind w:firstLine="432"/>
-      </w:pPr>
-    </w:p>
-    <w:p>
-      <w:pPr>
-        <w:pStyle w:val="ACMRef"/>
-        <w:ind w:firstLine="432"/>
-      </w:pPr>
-    </w:p>
-    <w:p>
-      <w:pPr>
-        <w:pStyle w:val="ACMRef"/>
-        <w:ind w:firstLine="432"/>
-      </w:pPr>
-    </w:p>
-    <w:p>
-      <w:pPr>
-        <w:pStyle w:val="ACMRef"/>
-        <w:ind w:firstLine="432"/>
-      </w:pPr>
-    </w:p>
-    <w:p>
-      <w:pPr>
-        <w:pStyle w:val="ACMRef"/>
-        <w:ind w:firstLine="432"/>
-      </w:pPr>
-    </w:p>
-    <w:p>
-      <w:pPr>
-        <w:pStyle w:val="ACMRef"/>
-        <w:ind w:firstLine="432"/>
-      </w:pPr>
-    </w:p>
-    <w:p>
-      <w:pPr>
-        <w:pStyle w:val="ACMRef"/>
-        <w:ind w:firstLine="432"/>
-      </w:pPr>
-    </w:p>
-    <w:p>
-      <w:pPr>
-        <w:pStyle w:val="ACMRef"/>
-        <w:ind w:firstLine="432"/>
-      </w:pPr>
-    </w:p>
-    <w:p>
-      <w:pPr>
-        <w:pStyle w:val="Head1"/>
-        <w:tabs>
-          <w:tab w:val="clear" w:pos="360"/>
-        </w:tabs>
-        <w:ind w:left="432" w:hanging="432"/>
-      </w:pPr>
-      <w:r>
-        <w:t>technical details:</w:t>
-      </w:r>
-    </w:p>
-    <w:p>
-      <w:pPr>
-        <w:pStyle w:val="Para"/>
-        <w:rPr>
-          <w:lang w:eastAsia="en-US"/>
-        </w:rPr>
-      </w:pPr>
-      <w:r>
-        <w:rPr>
-          <w:lang w:eastAsia="en-US"/>
-        </w:rPr>
-        <w:t>This is the most important section for us, as computer scientists, to understand and elucidate.</w:t>
-      </w:r>
-    </w:p>
-    <w:p>
-      <w:pPr>
-        <w:pStyle w:val="Para"/>
-        <w:rPr>
-          <w:lang w:eastAsia="en-US"/>
-        </w:rPr>
-      </w:pPr>
-      <w:r>
-        <w:rPr>
-          <w:lang w:eastAsia="en-US"/>
-        </w:rPr>
-        <w:t xml:space="preserve">• How does Pegasus, or software </w:t>
-      </w:r>
-      <w:proofErr w:type="gramStart"/>
-      <w:r>
-        <w:rPr>
-          <w:lang w:eastAsia="en-US"/>
-        </w:rPr>
-        <w:t>similar to</w:t>
-      </w:r>
-      <w:proofErr w:type="gramEnd"/>
-      <w:r>
-        <w:rPr>
-          <w:lang w:eastAsia="en-US"/>
-        </w:rPr>
-        <w:t xml:space="preserve"> it, infect a phone without the user’s input?</w:t>
-      </w:r>
-    </w:p>
-    <w:p>
-      <w:pPr>
-        <w:pStyle w:val="ParaContinue"/>
-        <w:rPr>
-          <w:lang w:eastAsia="en-US"/>
-        </w:rPr>
-      </w:pPr>
-    </w:p>
-    <w:p>
-      <w:pPr>
-        <w:pStyle w:val="Para"/>
-        <w:rPr>
-          <w:lang w:eastAsia="en-US"/>
-        </w:rPr>
-      </w:pPr>
-      <w:r>
-        <w:rPr>
-          <w:lang w:eastAsia="en-US"/>
-        </w:rPr>
-        <w:t>• What are the technical underpinnings of the algorithms required to implement such an attack?</w:t>
-      </w:r>
-    </w:p>
-    <w:p>
-      <w:pPr>
-        <w:pStyle w:val="ParaContinue"/>
-        <w:rPr>
-          <w:lang w:eastAsia="en-US"/>
-        </w:rPr>
-      </w:pPr>
-    </w:p>
-    <w:p>
-      <w:pPr>
-        <w:pStyle w:val="Para"/>
-        <w:rPr>
-          <w:lang w:eastAsia="en-US"/>
-        </w:rPr>
-      </w:pPr>
-      <w:r>
-        <w:rPr>
-          <w:lang w:eastAsia="en-US"/>
-        </w:rPr>
-        <w:t>• How would we counter, or prevent, such an attack in our code?</w:t>
-      </w:r>
-    </w:p>
-    <w:p>
-      <w:pPr>
-        <w:pStyle w:val="ParaContinue"/>
-        <w:rPr>
-          <w:lang w:eastAsia="en-US"/>
-        </w:rPr>
-      </w:pPr>
-    </w:p>
-    <w:p>
-      <w:pPr>
-        <w:pStyle w:val="ACMRef"/>
-      </w:pPr>
-      <w:r>
-        <w:t>Provide a detailed description - use pseudo-code, block diagrams, and other necessary means to convey your research and analysis.</w:t>
-      </w:r>
-    </w:p>
-    <w:p>
-      <w:pPr>
-        <w:pStyle w:val="ACMRef"/>
-      </w:pPr>
-      <w:hyperlink r:id="rId20" w:history="1">
-        <w:r>
-          <w:rPr>
-            <w:rStyle w:val="Hyperlink"/>
-          </w:rPr>
-          <w:t>https://www.amnesty.org/en/latest/research/2021/07/forensic-methodology-report-how-to-catch-nso-groups-pegasus/</w:t>
-        </w:r>
-      </w:hyperlink>
-    </w:p>
-    <w:p>
-      <w:pPr>
-        <w:pStyle w:val="ACMRef"/>
-      </w:pPr>
-      <w:hyperlink r:id="rId21" w:history="1">
-        <w:r>
-          <w:rPr>
-            <w:rStyle w:val="Hyperlink"/>
-          </w:rPr>
-          <w:t>https://en.wikipedia.org/wiki/Pegasus_(spyware)</w:t>
-        </w:r>
-      </w:hyperlink>
-    </w:p>
-    <w:p>
-      <w:pPr>
-        <w:pStyle w:val="ACMRef"/>
-      </w:pPr>
-      <w:hyperlink r:id="rId22" w:history="1">
-        <w:r>
-          <w:rPr>
-            <w:rStyle w:val="Hyperlink"/>
-          </w:rPr>
-          <w:t>https://ijclinic.law.uci.edu/clipping-pegasuss-wings/basics-of-pegasus/</w:t>
-        </w:r>
-      </w:hyperlink>
-    </w:p>
-    <w:p>
-      <w:pPr>
-        <w:pStyle w:val="ACMRef"/>
-      </w:pPr>
-      <w:hyperlink r:id="rId23" w:history="1">
-        <w:r>
-          <w:rPr>
-            <w:rStyle w:val="Hyperlink"/>
-          </w:rPr>
-          <w:t>https://www.geeksforgeeks.org/blogs/what-is-pegasus-spyware-and-how-it-works/</w:t>
-        </w:r>
-      </w:hyperlink>
-    </w:p>
-    <w:p>
-      <w:pPr>
-        <w:pStyle w:val="ACMRef"/>
-      </w:pPr>
-      <w:hyperlink r:id="rId24" w:history="1">
+      <w:hyperlink r:id="rId26" w:history="1">
         <w:r>
           <w:rPr>
             <w:rStyle w:val="Hyperlink"/>
@@ -1365,7 +1676,7 @@
       <w:pPr>
         <w:pStyle w:val="ACMRef"/>
       </w:pPr>
-      <w:hyperlink r:id="rId25" w:history="1">
+      <w:hyperlink r:id="rId27" w:history="1">
         <w:r>
           <w:rPr>
             <w:rStyle w:val="Hyperlink"/>
@@ -1378,6 +1689,24 @@
       <w:pPr>
         <w:pStyle w:val="ACMRef"/>
       </w:pPr>
+      <w:hyperlink r:id="rId28" w:history="1">
+        <w:r>
+          <w:rPr>
+            <w:rStyle w:val="Hyperlink"/>
+          </w:rPr>
+          <w:t>https://support.apple.com/guide/security/blastdoor-for-messages-and-ids-secd3c881cee/web (6)</w:t>
+        </w:r>
+      </w:hyperlink>
+    </w:p>
+    <w:p>
+      <w:pPr>
+        <w:pStyle w:val="ACMRef"/>
+      </w:pPr>
+    </w:p>
+    <w:p>
+      <w:pPr>
+        <w:pStyle w:val="ACMRef"/>
+      </w:pPr>
     </w:p>
     <w:p>
       <w:pPr>
@@ -1958,7 +2287,6 @@
         <w:ind w:left="432" w:hanging="432"/>
       </w:pPr>
       <w:r>
-        <w:lastRenderedPageBreak/>
         <w:t>ethical analysis and conclusion:</w:t>
       </w:r>
     </w:p>
@@ -1982,8 +2310,108 @@
     <w:p>
       <w:pPr>
         <w:pStyle w:val="ACMRef"/>
-      </w:pPr>
-      <w:hyperlink r:id="rId26" w:history="1">
+        <w:numPr>
+          <w:ilvl w:val="0"/>
+          <w:numId w:val="16"/>
+        </w:numPr>
+      </w:pPr>
+      <w:r>
+        <w:rPr>
+          <w:b/>
+          <w:bCs w:val="0"/>
+        </w:rPr>
+        <w:t>QUOTE</w:t>
+      </w:r>
+      <w:r>
+        <w:t>: “</w:t>
+      </w:r>
+      <w:r>
+        <w:t>transnational repression, which is the practice of authoritarian governments targeting dissidents, journalists and activists outside of their sovereign borders to silence dissent.</w:t>
+      </w:r>
+      <w:r>
+        <w:t>” (5)</w:t>
+      </w:r>
+    </w:p>
+    <w:p>
+      <w:pPr>
+        <w:pStyle w:val="ACMRef"/>
+        <w:numPr>
+          <w:ilvl w:val="0"/>
+          <w:numId w:val="16"/>
+        </w:numPr>
+      </w:pPr>
+      <w:r>
+        <w:rPr>
+          <w:b/>
+          <w:bCs w:val="0"/>
+        </w:rPr>
+        <w:t>QUOTE</w:t>
+      </w:r>
+      <w:r>
+        <w:t>:</w:t>
+      </w:r>
+      <w:r>
+        <w:t xml:space="preserve"> “</w:t>
+      </w:r>
+      <w:r>
+        <w:t>Short of not using a device, there is no way to prevent exploitation by a zero-click exploit; it's a weapon against which there is no defense.</w:t>
+      </w:r>
+      <w:r>
+        <w:t>” (5)</w:t>
+      </w:r>
+    </w:p>
+    <w:p>
+      <w:pPr>
+        <w:pStyle w:val="ACMRef"/>
+        <w:numPr>
+          <w:ilvl w:val="0"/>
+          <w:numId w:val="16"/>
+        </w:numPr>
+      </w:pPr>
+      <w:r>
+        <w:rPr>
+          <w:b/>
+          <w:bCs w:val="0"/>
+        </w:rPr>
+        <w:t>QUOTE</w:t>
+      </w:r>
+      <w:r>
+        <w:t>: “</w:t>
+      </w:r>
+      <w:r>
+        <w:t>PDF was a popular target for exploitation around a decade ago, due to its ubiquity and complexity.</w:t>
+      </w:r>
+      <w:r>
+        <w:t>” (5)</w:t>
+      </w:r>
+    </w:p>
+    <w:p>
+      <w:pPr>
+        <w:pStyle w:val="ACMRef"/>
+        <w:numPr>
+          <w:ilvl w:val="0"/>
+          <w:numId w:val="16"/>
+        </w:numPr>
+      </w:pPr>
+    </w:p>
+    <w:p>
+      <w:pPr>
+        <w:pStyle w:val="ACMRef"/>
+      </w:pPr>
+      <w:hyperlink r:id="rId29" w:history="1">
+        <w:r>
+          <w:rPr>
+            <w:rStyle w:val="Hyperlink"/>
+          </w:rPr>
+          <w:t>https://projectzero.google/2021/12/a-deep-dive-into-nso-zero-click.html (5)</w:t>
+        </w:r>
+      </w:hyperlink>
+    </w:p>
+    <w:p>
+      <w:pPr>
+        <w:pStyle w:val="ACMRef"/>
+      </w:pPr>
+      <w:hyperlink r:id="rId30" w:history="1">
         <w:r>
           <w:rPr>
             <w:rStyle w:val="Hyperlink"/>
@@ -1996,7 +2424,7 @@
       <w:pPr>
         <w:pStyle w:val="ACMRef"/>
       </w:pPr>
-      <w:hyperlink r:id="rId27" w:history="1">
+      <w:hyperlink r:id="rId31" w:history="1">
         <w:r>
           <w:rPr>
             <w:rStyle w:val="Hyperlink"/>
@@ -2009,7 +2437,7 @@
       <w:pPr>
         <w:pStyle w:val="ACMRef"/>
       </w:pPr>
-      <w:hyperlink r:id="rId28" w:history="1">
+      <w:hyperlink r:id="rId32" w:history="1">
         <w:r>
           <w:rPr>
             <w:rStyle w:val="Hyperlink"/>
@@ -2356,6 +2784,7 @@
         <w:ind w:left="432" w:hanging="432"/>
       </w:pPr>
       <w:r>
+        <w:lastRenderedPageBreak/>
         <w:t>beyond the superficial:</w:t>
       </w:r>
     </w:p>
@@ -2752,6 +3181,7 @@
         <w:pStyle w:val="Head1"/>
       </w:pPr>
       <w:r>
+        <w:lastRenderedPageBreak/>
         <w:t>REFERENCES</w:t>
       </w:r>
     </w:p>
@@ -2797,7 +3227,7 @@
       <w:r>
         <w:t xml:space="preserve">Sam Anzaroot and Andrew McCallum. 2013. UMass Citation Field Extraction Dataset. Retrieved May 27, 2019 from </w:t>
       </w:r>
-      <w:hyperlink r:id="rId29" w:history="1">
+      <w:hyperlink r:id="rId33" w:history="1">
         <w:r>
           <w:rPr>
             <w:rStyle w:val="Hyperlink"/>
@@ -2879,7 +3309,7 @@
       <w:r>
         <w:t xml:space="preserve">David Harel. 1979. First-Order Dynamic Logic. Lecture Notes in Computer Science, Vol. 68. Springer-Verlag, New York, NY.  </w:t>
       </w:r>
-      <w:hyperlink r:id="rId30" w:history="1">
+      <w:hyperlink r:id="rId34" w:history="1">
         <w:r>
           <w:rPr>
             <w:rStyle w:val="Hyperlink"/>
@@ -2924,7 +3354,7 @@
       <w:r>
         <w:t xml:space="preserve">to computer document formatting. In Proceedings of the 7th Annual Symposium on Principles of Programming Languages. ACM, New York, 24–31. </w:t>
       </w:r>
-      <w:hyperlink r:id="rId31" w:history="1">
+      <w:hyperlink r:id="rId35" w:history="1">
         <w:r>
           <w:t>https://doi.org/10.1145/567446.567449</w:t>
         </w:r>
@@ -2956,7 +3386,7 @@
       <w:r>
         <w:t xml:space="preserve">TUG 2017. Institutional members of the LaTeX Users Group.  Retrieved May 27, 2017 from </w:t>
       </w:r>
-      <w:hyperlink r:id="rId32" w:history="1">
+      <w:hyperlink r:id="rId36" w:history="1">
         <w:r>
           <w:rPr>
             <w:rStyle w:val="Hyperlink"/>
@@ -3062,7 +3492,7 @@
       <w:r>
         <w:t xml:space="preserve">Equations should be created with the built-in Microsoft® Equation Editor included with your version of Word. (Please check the compatibility at </w:t>
       </w:r>
-      <w:hyperlink r:id="rId33" w:history="1">
+      <w:hyperlink r:id="rId37" w:history="1">
         <w:r>
           <w:rPr>
             <w:rStyle w:val="Hyperlink"/>
@@ -3212,6 +3642,7 @@
         <w:ind w:left="480" w:hanging="240"/>
       </w:pPr>
       <w:r>
+        <w:lastRenderedPageBreak/>
         <w:t>MS</w:t>
       </w:r>
       <w:r>
@@ -3310,8 +3741,8 @@
       </w:r>
     </w:p>
     <w:sectPr>
-      <w:footerReference w:type="default" r:id="rId34"/>
-      <w:footerReference w:type="first" r:id="rId35"/>
+      <w:footerReference w:type="default" r:id="rId38"/>
+      <w:footerReference w:type="first" r:id="rId39"/>
       <w:pgSz w:w="12240" w:h="15840"/>
       <w:pgMar w:top="1760" w:right="2040" w:bottom="2840" w:left="1440" w:header="706" w:footer="706" w:gutter="0"/>
       <w:cols w:space="708"/>

</xml_diff>